<commit_message>
added screenshots for pdf
</commit_message>
<xml_diff>
--- a/Git-Guide.docx
+++ b/Git-Guide.docx
@@ -98,6 +98,48 @@
       <w:pPr>
         <w:ind w:left="360"/>
       </w:pPr>
+      <w:r>
+        <w:drawing>
+          <wp:inline distT="0" distB="0" distL="0" distR="0" wp14:anchorId="5CE29F01" wp14:editId="570F8CE0">
+            <wp:extent cx="5731510" cy="2952115"/>
+            <wp:effectExtent l="0" t="0" r="2540" b="635"/>
+            <wp:docPr id="1754355748" name="Picture 1"/>
+            <wp:cNvGraphicFramePr>
+              <a:graphicFrameLocks xmlns:a="http://schemas.openxmlformats.org/drawingml/2006/main" noChangeAspect="1"/>
+            </wp:cNvGraphicFramePr>
+            <a:graphic xmlns:a="http://schemas.openxmlformats.org/drawingml/2006/main">
+              <a:graphicData uri="http://schemas.openxmlformats.org/drawingml/2006/picture">
+                <pic:pic xmlns:pic="http://schemas.openxmlformats.org/drawingml/2006/picture">
+                  <pic:nvPicPr>
+                    <pic:cNvPr id="1754355748" name=""/>
+                    <pic:cNvPicPr/>
+                  </pic:nvPicPr>
+                  <pic:blipFill>
+                    <a:blip r:embed="rId5"/>
+                    <a:stretch>
+                      <a:fillRect/>
+                    </a:stretch>
+                  </pic:blipFill>
+                  <pic:spPr>
+                    <a:xfrm>
+                      <a:off x="0" y="0"/>
+                      <a:ext cx="5731510" cy="2952115"/>
+                    </a:xfrm>
+                    <a:prstGeom prst="rect">
+                      <a:avLst/>
+                    </a:prstGeom>
+                  </pic:spPr>
+                </pic:pic>
+              </a:graphicData>
+            </a:graphic>
+          </wp:inline>
+        </w:drawing>
+      </w:r>
+    </w:p>
+    <w:p>
+      <w:pPr>
+        <w:ind w:left="360"/>
+      </w:pPr>
     </w:p>
     <w:p>
       <w:pPr>
@@ -144,6 +186,64 @@
       <w:pPr>
         <w:ind w:left="360"/>
       </w:pPr>
+      <w:r>
+        <w:rPr>
+          <w:noProof/>
+        </w:rPr>
+        <w:drawing>
+          <wp:inline distT="0" distB="0" distL="0" distR="0" wp14:anchorId="25E27B5E" wp14:editId="604E8DC0">
+            <wp:extent cx="5731510" cy="1357630"/>
+            <wp:effectExtent l="0" t="0" r="2540" b="0"/>
+            <wp:docPr id="1286171290" name="Picture 1"/>
+            <wp:cNvGraphicFramePr>
+              <a:graphicFrameLocks xmlns:a="http://schemas.openxmlformats.org/drawingml/2006/main" noChangeAspect="1"/>
+            </wp:cNvGraphicFramePr>
+            <a:graphic xmlns:a="http://schemas.openxmlformats.org/drawingml/2006/main">
+              <a:graphicData uri="http://schemas.openxmlformats.org/drawingml/2006/picture">
+                <pic:pic xmlns:pic="http://schemas.openxmlformats.org/drawingml/2006/picture">
+                  <pic:nvPicPr>
+                    <pic:cNvPr id="0" name="Picture 1"/>
+                    <pic:cNvPicPr>
+                      <a:picLocks noChangeAspect="1" noChangeArrowheads="1"/>
+                    </pic:cNvPicPr>
+                  </pic:nvPicPr>
+                  <pic:blipFill>
+                    <a:blip r:embed="rId6">
+                      <a:extLst>
+                        <a:ext uri="{28A0092B-C50C-407E-A947-70E740481C1C}">
+                          <a14:useLocalDpi xmlns:a14="http://schemas.microsoft.com/office/drawing/2010/main" val="0"/>
+                        </a:ext>
+                      </a:extLst>
+                    </a:blip>
+                    <a:srcRect/>
+                    <a:stretch>
+                      <a:fillRect/>
+                    </a:stretch>
+                  </pic:blipFill>
+                  <pic:spPr bwMode="auto">
+                    <a:xfrm>
+                      <a:off x="0" y="0"/>
+                      <a:ext cx="5731510" cy="1357630"/>
+                    </a:xfrm>
+                    <a:prstGeom prst="rect">
+                      <a:avLst/>
+                    </a:prstGeom>
+                    <a:noFill/>
+                    <a:ln>
+                      <a:noFill/>
+                    </a:ln>
+                  </pic:spPr>
+                </pic:pic>
+              </a:graphicData>
+            </a:graphic>
+          </wp:inline>
+        </w:drawing>
+      </w:r>
+    </w:p>
+    <w:p>
+      <w:pPr>
+        <w:ind w:left="360"/>
+      </w:pPr>
     </w:p>
     <w:p>
       <w:pPr>
@@ -190,6 +290,65 @@
       <w:pPr>
         <w:ind w:left="360"/>
       </w:pPr>
+      <w:r>
+        <w:rPr>
+          <w:noProof/>
+        </w:rPr>
+        <w:lastRenderedPageBreak/>
+        <w:drawing>
+          <wp:inline distT="0" distB="0" distL="0" distR="0" wp14:anchorId="56D1F9CD" wp14:editId="02FB2FE0">
+            <wp:extent cx="5731510" cy="948055"/>
+            <wp:effectExtent l="0" t="0" r="2540" b="4445"/>
+            <wp:docPr id="1857345615" name="Picture 3"/>
+            <wp:cNvGraphicFramePr>
+              <a:graphicFrameLocks xmlns:a="http://schemas.openxmlformats.org/drawingml/2006/main" noChangeAspect="1"/>
+            </wp:cNvGraphicFramePr>
+            <a:graphic xmlns:a="http://schemas.openxmlformats.org/drawingml/2006/main">
+              <a:graphicData uri="http://schemas.openxmlformats.org/drawingml/2006/picture">
+                <pic:pic xmlns:pic="http://schemas.openxmlformats.org/drawingml/2006/picture">
+                  <pic:nvPicPr>
+                    <pic:cNvPr id="0" name="Picture 3"/>
+                    <pic:cNvPicPr>
+                      <a:picLocks noChangeAspect="1" noChangeArrowheads="1"/>
+                    </pic:cNvPicPr>
+                  </pic:nvPicPr>
+                  <pic:blipFill>
+                    <a:blip r:embed="rId7">
+                      <a:extLst>
+                        <a:ext uri="{28A0092B-C50C-407E-A947-70E740481C1C}">
+                          <a14:useLocalDpi xmlns:a14="http://schemas.microsoft.com/office/drawing/2010/main" val="0"/>
+                        </a:ext>
+                      </a:extLst>
+                    </a:blip>
+                    <a:srcRect/>
+                    <a:stretch>
+                      <a:fillRect/>
+                    </a:stretch>
+                  </pic:blipFill>
+                  <pic:spPr bwMode="auto">
+                    <a:xfrm>
+                      <a:off x="0" y="0"/>
+                      <a:ext cx="5731510" cy="948055"/>
+                    </a:xfrm>
+                    <a:prstGeom prst="rect">
+                      <a:avLst/>
+                    </a:prstGeom>
+                    <a:noFill/>
+                    <a:ln>
+                      <a:noFill/>
+                    </a:ln>
+                  </pic:spPr>
+                </pic:pic>
+              </a:graphicData>
+            </a:graphic>
+          </wp:inline>
+        </w:drawing>
+      </w:r>
+    </w:p>
+    <w:p>
+      <w:pPr>
+        <w:ind w:left="360"/>
+      </w:pPr>
     </w:p>
     <w:p>
       <w:pPr>
@@ -236,6 +395,48 @@
       <w:pPr>
         <w:ind w:left="360"/>
       </w:pPr>
+      <w:r>
+        <w:drawing>
+          <wp:inline distT="0" distB="0" distL="0" distR="0" wp14:anchorId="433607AE" wp14:editId="2EFDA17E">
+            <wp:extent cx="5731510" cy="408305"/>
+            <wp:effectExtent l="0" t="0" r="2540" b="0"/>
+            <wp:docPr id="437893757" name="Picture 1"/>
+            <wp:cNvGraphicFramePr>
+              <a:graphicFrameLocks xmlns:a="http://schemas.openxmlformats.org/drawingml/2006/main" noChangeAspect="1"/>
+            </wp:cNvGraphicFramePr>
+            <a:graphic xmlns:a="http://schemas.openxmlformats.org/drawingml/2006/main">
+              <a:graphicData uri="http://schemas.openxmlformats.org/drawingml/2006/picture">
+                <pic:pic xmlns:pic="http://schemas.openxmlformats.org/drawingml/2006/picture">
+                  <pic:nvPicPr>
+                    <pic:cNvPr id="437893757" name=""/>
+                    <pic:cNvPicPr/>
+                  </pic:nvPicPr>
+                  <pic:blipFill>
+                    <a:blip r:embed="rId8"/>
+                    <a:stretch>
+                      <a:fillRect/>
+                    </a:stretch>
+                  </pic:blipFill>
+                  <pic:spPr>
+                    <a:xfrm>
+                      <a:off x="0" y="0"/>
+                      <a:ext cx="5731510" cy="408305"/>
+                    </a:xfrm>
+                    <a:prstGeom prst="rect">
+                      <a:avLst/>
+                    </a:prstGeom>
+                  </pic:spPr>
+                </pic:pic>
+              </a:graphicData>
+            </a:graphic>
+          </wp:inline>
+        </w:drawing>
+      </w:r>
+    </w:p>
+    <w:p>
+      <w:pPr>
+        <w:ind w:left="360"/>
+      </w:pPr>
     </w:p>
     <w:p>
       <w:pPr>
@@ -254,13 +455,50 @@
         <w:ind w:left="360"/>
       </w:pPr>
       <w:r>
-        <w:t>Uploads your latest commit to the repository.</w:t>
+        <w:t>Uploads your latest commit to the repository</w:t>
       </w:r>
     </w:p>
     <w:p>
       <w:pPr>
         <w:ind w:left="360"/>
       </w:pPr>
+      <w:r>
+        <w:drawing>
+          <wp:inline distT="0" distB="0" distL="0" distR="0" wp14:anchorId="0FC83D84" wp14:editId="5219F537">
+            <wp:extent cx="5731510" cy="1602740"/>
+            <wp:effectExtent l="0" t="0" r="2540" b="0"/>
+            <wp:docPr id="242108689" name="Picture 1"/>
+            <wp:cNvGraphicFramePr>
+              <a:graphicFrameLocks xmlns:a="http://schemas.openxmlformats.org/drawingml/2006/main" noChangeAspect="1"/>
+            </wp:cNvGraphicFramePr>
+            <a:graphic xmlns:a="http://schemas.openxmlformats.org/drawingml/2006/main">
+              <a:graphicData uri="http://schemas.openxmlformats.org/drawingml/2006/picture">
+                <pic:pic xmlns:pic="http://schemas.openxmlformats.org/drawingml/2006/picture">
+                  <pic:nvPicPr>
+                    <pic:cNvPr id="242108689" name=""/>
+                    <pic:cNvPicPr/>
+                  </pic:nvPicPr>
+                  <pic:blipFill>
+                    <a:blip r:embed="rId9"/>
+                    <a:stretch>
+                      <a:fillRect/>
+                    </a:stretch>
+                  </pic:blipFill>
+                  <pic:spPr>
+                    <a:xfrm>
+                      <a:off x="0" y="0"/>
+                      <a:ext cx="5731510" cy="1602740"/>
+                    </a:xfrm>
+                    <a:prstGeom prst="rect">
+                      <a:avLst/>
+                    </a:prstGeom>
+                  </pic:spPr>
+                </pic:pic>
+              </a:graphicData>
+            </a:graphic>
+          </wp:inline>
+        </w:drawing>
+      </w:r>
     </w:p>
     <w:p>
       <w:pPr>
@@ -349,7 +587,6 @@
         </w:numPr>
       </w:pPr>
       <w:r>
-        <w:lastRenderedPageBreak/>
         <w:t xml:space="preserve">Git </w:t>
       </w:r>
       <w:proofErr w:type="gramStart"/>
@@ -374,6 +611,11 @@
       <w:r>
         <w:t>.</w:t>
       </w:r>
+    </w:p>
+    <w:p>
+      <w:pPr>
+        <w:ind w:left="360"/>
+      </w:pPr>
     </w:p>
     <w:p>
       <w:pPr>
@@ -392,7 +634,22 @@
         </w:rPr>
       </w:pPr>
       <w:r>
+        <w:lastRenderedPageBreak/>
         <w:t>Git config</w:t>
+      </w:r>
+    </w:p>
+    <w:p>
+      <w:pPr>
+        <w:ind w:left="360"/>
+      </w:pPr>
+      <w:r>
+        <w:t>Gets or sets Git configuration, such as your identity, default editor, or aliases</w:t>
+      </w:r>
+      <w:r>
+        <w:t xml:space="preserve"> if it does not already know the user or there are multiple users on the system</w:t>
+      </w:r>
+      <w:r>
+        <w:t>.</w:t>
       </w:r>
     </w:p>
     <w:p>
@@ -403,13 +660,58 @@
         </w:rPr>
       </w:pPr>
       <w:r>
-        <w:t>Gets or sets Git configuration, such as your identity, default editor, or aliases</w:t>
-      </w:r>
-      <w:r>
-        <w:t xml:space="preserve"> if it does not already know the user or there are multiple users on the system</w:t>
-      </w:r>
-      <w:r>
-        <w:t>.</w:t>
+        <w:rPr>
+          <w:noProof/>
+          <w:lang w:val="en-IE"/>
+        </w:rPr>
+        <w:drawing>
+          <wp:inline distT="0" distB="0" distL="0" distR="0" wp14:anchorId="6D73A1C1" wp14:editId="3E492525">
+            <wp:extent cx="5731510" cy="842645"/>
+            <wp:effectExtent l="0" t="0" r="2540" b="0"/>
+            <wp:docPr id="1395758356" name="Picture 2"/>
+            <wp:cNvGraphicFramePr>
+              <a:graphicFrameLocks xmlns:a="http://schemas.openxmlformats.org/drawingml/2006/main" noChangeAspect="1"/>
+            </wp:cNvGraphicFramePr>
+            <a:graphic xmlns:a="http://schemas.openxmlformats.org/drawingml/2006/main">
+              <a:graphicData uri="http://schemas.openxmlformats.org/drawingml/2006/picture">
+                <pic:pic xmlns:pic="http://schemas.openxmlformats.org/drawingml/2006/picture">
+                  <pic:nvPicPr>
+                    <pic:cNvPr id="0" name="Picture 2"/>
+                    <pic:cNvPicPr>
+                      <a:picLocks noChangeAspect="1" noChangeArrowheads="1"/>
+                    </pic:cNvPicPr>
+                  </pic:nvPicPr>
+                  <pic:blipFill>
+                    <a:blip r:embed="rId10">
+                      <a:extLst>
+                        <a:ext uri="{28A0092B-C50C-407E-A947-70E740481C1C}">
+                          <a14:useLocalDpi xmlns:a14="http://schemas.microsoft.com/office/drawing/2010/main" val="0"/>
+                        </a:ext>
+                      </a:extLst>
+                    </a:blip>
+                    <a:srcRect/>
+                    <a:stretch>
+                      <a:fillRect/>
+                    </a:stretch>
+                  </pic:blipFill>
+                  <pic:spPr bwMode="auto">
+                    <a:xfrm>
+                      <a:off x="0" y="0"/>
+                      <a:ext cx="5731510" cy="842645"/>
+                    </a:xfrm>
+                    <a:prstGeom prst="rect">
+                      <a:avLst/>
+                    </a:prstGeom>
+                    <a:noFill/>
+                    <a:ln>
+                      <a:noFill/>
+                    </a:ln>
+                  </pic:spPr>
+                </pic:pic>
+              </a:graphicData>
+            </a:graphic>
+          </wp:inline>
+        </w:drawing>
       </w:r>
     </w:p>
     <w:p>
@@ -621,7 +923,7 @@
   <w:abstractNum w:abstractNumId="2" w15:restartNumberingAfterBreak="0">
     <w:nsid w:val="371C737A"/>
     <w:multiLevelType w:val="hybridMultilevel"/>
-    <w:tmpl w:val="EDFA2CA4"/>
+    <w:tmpl w:val="A134B9B0"/>
     <w:lvl w:ilvl="0" w:tplc="1809000F">
       <w:start w:val="1"/>
       <w:numFmt w:val="decimal"/>

</xml_diff>